<commit_message>
Specs: the 58 QCSP 001 sheets (HTML, PDF, Word) print TAMC/TYMC with the QCSP001_v02 maxima (#233)
Co-Authored-By: Claude Opus 5.5 <noreply@anthropic.com>
Claude-Session: https://claude.ai/code/session_01DyBhj47i7bhaCyNMB1iwdv
</commit_message>
<xml_diff>
--- a/deliverables/qc_gap_analysis/specs/QCSP_001_ImB/DOCX/QCSP_001_BG-II_v.01_Blue_Gelato_Grade_II.docx
+++ b/deliverables/qc_gap_analysis/specs/QCSP_001_ImB/DOCX/QCSP_001_BG-II_v.01_Blue_Gelato_Grade_II.docx
@@ -411,7 +411,7 @@
     </w:p>
     <w:p>
       <w:pPr>
-        <w:framePr w:w="539" w:hRule="auto" w:wrap="none" w:vAnchor="page" w:hAnchor="page" w:x="1765" w:y="3693"/>
+        <w:framePr w:w="539" w:hRule="auto" w:wrap="none" w:vAnchor="page" w:hAnchor="page" w:x="1805" w:y="3693"/>
         <w:spacing w:before="0" w:after="0" w:line="110" w:lineRule="exact"/>
         <w:ind w:left="0" w:right="0" w:firstLine="0"/>
         <w:jc w:val="left"/>
@@ -445,7 +445,7 @@
     </w:p>
     <w:p>
       <w:pPr>
-        <w:framePr w:w="440" w:hRule="auto" w:wrap="none" w:vAnchor="page" w:hAnchor="page" w:x="2649" w:y="3689"/>
+        <w:framePr w:w="440" w:hRule="auto" w:wrap="none" w:vAnchor="page" w:hAnchor="page" w:x="2727" w:y="3689"/>
         <w:spacing w:before="0" w:after="0" w:line="100" w:lineRule="exact"/>
         <w:ind w:left="0" w:right="0" w:firstLine="0"/>
         <w:jc w:val="left"/>
@@ -479,7 +479,7 @@
     </w:p>
     <w:p>
       <w:pPr>
-        <w:framePr w:w="440" w:hRule="auto" w:wrap="none" w:vAnchor="page" w:hAnchor="page" w:x="3421" w:y="3689"/>
+        <w:framePr w:w="440" w:hRule="auto" w:wrap="none" w:vAnchor="page" w:hAnchor="page" w:x="3535" w:y="3689"/>
         <w:spacing w:before="0" w:after="0" w:line="100" w:lineRule="exact"/>
         <w:ind w:left="0" w:right="0" w:firstLine="0"/>
         <w:jc w:val="left"/>
@@ -513,7 +513,7 @@
     </w:p>
     <w:p>
       <w:pPr>
-        <w:framePr w:w="903" w:hRule="auto" w:wrap="none" w:vAnchor="page" w:hAnchor="page" w:x="4936" w:y="3604"/>
+        <w:framePr w:w="903" w:hRule="auto" w:wrap="none" w:vAnchor="page" w:hAnchor="page" w:x="4916" w:y="3604"/>
         <w:spacing w:before="0" w:after="0" w:line="110" w:lineRule="exact"/>
         <w:ind w:left="0" w:right="0" w:firstLine="0"/>
         <w:jc w:val="left"/>
@@ -547,7 +547,7 @@
     </w:p>
     <w:p>
       <w:pPr>
-        <w:framePr w:w="566" w:hRule="auto" w:wrap="none" w:vAnchor="page" w:hAnchor="page" w:x="4936" w:y="3767"/>
+        <w:framePr w:w="566" w:hRule="auto" w:wrap="none" w:vAnchor="page" w:hAnchor="page" w:x="4916" w:y="3767"/>
         <w:spacing w:before="0" w:after="0" w:line="90" w:lineRule="exact"/>
         <w:ind w:left="0" w:right="0" w:firstLine="0"/>
         <w:jc w:val="left"/>
@@ -581,7 +581,7 @@
     </w:p>
     <w:p>
       <w:pPr>
-        <w:framePr w:w="319" w:hRule="auto" w:wrap="none" w:vAnchor="page" w:hAnchor="page" w:x="6140" w:y="3693"/>
+        <w:framePr w:w="319" w:hRule="auto" w:wrap="none" w:vAnchor="page" w:hAnchor="page" w:x="6160" w:y="3693"/>
         <w:spacing w:before="0" w:after="0" w:line="110" w:lineRule="exact"/>
         <w:ind w:left="0" w:right="0" w:firstLine="0"/>
         <w:jc w:val="left"/>
@@ -602,7 +602,7 @@
     </w:p>
     <w:p>
       <w:pPr>
-        <w:framePr w:w="260" w:hRule="auto" w:wrap="none" w:vAnchor="page" w:hAnchor="page" w:x="6775" w:y="3689"/>
+        <w:framePr w:w="260" w:hRule="auto" w:wrap="none" w:vAnchor="page" w:hAnchor="page" w:x="6832" w:y="3689"/>
         <w:spacing w:before="0" w:after="0" w:line="100" w:lineRule="exact"/>
         <w:ind w:left="0" w:right="0" w:firstLine="0"/>
         <w:jc w:val="left"/>
@@ -623,7 +623,7 @@
     </w:p>
     <w:p>
       <w:pPr>
-        <w:framePr w:w="947" w:hRule="auto" w:wrap="none" w:vAnchor="page" w:hAnchor="page" w:x="8102" w:y="3604"/>
+        <w:framePr w:w="947" w:hRule="auto" w:wrap="none" w:vAnchor="page" w:hAnchor="page" w:x="8024" w:y="3604"/>
         <w:spacing w:before="0" w:after="0" w:line="110" w:lineRule="exact"/>
         <w:ind w:left="0" w:right="0" w:firstLine="0"/>
         <w:jc w:val="left"/>
@@ -657,7 +657,7 @@
     </w:p>
     <w:p>
       <w:pPr>
-        <w:framePr w:w="686" w:hRule="auto" w:wrap="none" w:vAnchor="page" w:hAnchor="page" w:x="8102" w:y="3767"/>
+        <w:framePr w:w="686" w:hRule="auto" w:wrap="none" w:vAnchor="page" w:hAnchor="page" w:x="8024" w:y="3767"/>
         <w:spacing w:before="0" w:after="0" w:line="90" w:lineRule="exact"/>
         <w:ind w:left="0" w:right="0" w:firstLine="0"/>
         <w:jc w:val="left"/>
@@ -691,7 +691,7 @@
     </w:p>
     <w:p>
       <w:pPr>
-        <w:framePr w:w="640" w:hRule="auto" w:wrap="none" w:vAnchor="page" w:hAnchor="page" w:x="9343" w:y="3693"/>
+        <w:framePr w:w="640" w:hRule="auto" w:wrap="none" w:vAnchor="page" w:hAnchor="page" w:x="9306" w:y="3693"/>
         <w:spacing w:before="0" w:after="0" w:line="110" w:lineRule="exact"/>
         <w:ind w:left="0" w:right="0" w:firstLine="0"/>
         <w:jc w:val="left"/>
@@ -725,7 +725,7 @@
     </w:p>
     <w:p>
       <w:pPr>
-        <w:framePr w:w="723" w:hRule="auto" w:wrap="none" w:vAnchor="page" w:hAnchor="page" w:x="9979" w:y="3690"/>
+        <w:framePr w:w="723" w:hRule="auto" w:wrap="none" w:vAnchor="page" w:hAnchor="page" w:x="9942" w:y="3690"/>
         <w:spacing w:before="0" w:after="0" w:line="110" w:lineRule="exact"/>
         <w:ind w:left="0" w:right="0" w:firstLine="0"/>
         <w:jc w:val="left"/>
@@ -3934,7 +3934,7 @@
     </w:p>
     <w:p>
       <w:pPr>
-        <w:framePr w:w="476" w:hRule="auto" w:wrap="none" w:vAnchor="page" w:hAnchor="page" w:x="7877" w:y="9257"/>
+        <w:framePr w:w="1334" w:hRule="auto" w:wrap="none" w:vAnchor="page" w:hAnchor="page" w:x="7877" w:y="9257"/>
         <w:spacing w:before="0" w:after="0" w:line="110" w:lineRule="exact"/>
         <w:ind w:left="0" w:right="0" w:firstLine="0"/>
         <w:jc w:val="left"/>
@@ -3950,7 +3950,20 @@
           <w:sz w:val="11"/>
           <w:szCs w:val="11"/>
         </w:rPr>
-        <w:t xml:space="preserve"> CFU/g</w:t>
+        <w:t>, max 500 000 CFU</w:t>
+      </w:r>
+      <w:r>
+        <w:rPr>
+          <w:rFonts w:ascii="Roboto Mono" w:hAnsi="Roboto Mono" w:cs="Roboto Mono" w:eastAsia="Roboto Mono"/>
+          <w:b w:val="0"/>
+          <w:i w:val="0"/>
+          <w:color w:val="1E293B"/>
+          <w:spacing w:val="-7"/>
+          <w:kern w:val="0"/>
+          <w:sz w:val="11"/>
+          <w:szCs w:val="11"/>
+        </w:rPr>
+        <w:t>/g</w:t>
       </w:r>
     </w:p>
     <w:p>
@@ -4105,7 +4118,7 @@
     </w:p>
     <w:p>
       <w:pPr>
-        <w:framePr w:w="476" w:hRule="auto" w:wrap="none" w:vAnchor="page" w:hAnchor="page" w:x="7877" w:y="9422"/>
+        <w:framePr w:w="1268" w:hRule="auto" w:wrap="none" w:vAnchor="page" w:hAnchor="page" w:x="7877" w:y="9422"/>
         <w:spacing w:before="0" w:after="0" w:line="110" w:lineRule="exact"/>
         <w:ind w:left="0" w:right="0" w:firstLine="0"/>
         <w:jc w:val="left"/>
@@ -4121,7 +4134,7 @@
           <w:sz w:val="11"/>
           <w:szCs w:val="11"/>
         </w:rPr>
-        <w:t xml:space="preserve"> CFU/g</w:t>
+        <w:t>, max 50 000 CFU/g</w:t>
       </w:r>
     </w:p>
     <w:p>

</xml_diff>